<commit_message>
Add French village tenancy agreement (contrat de bail) with employee fill.
Ship contrat-bail document flow and template wiring, plus related village date handling, timesheet employee-tab/compilation fixes, attestation sticky signatories, AL/SL colors, and contrat-standard orthography updates.

Co-authored-by: Cursor <cursoragent@cursor.com>
</commit_message>
<xml_diff>
--- a/Excel/templates/contrats/contrat-standard.docx
+++ b/Excel/templates/contrats/contrat-standard.docx
@@ -158,7 +158,7 @@
         <w:rPr>
           <w:lang w:val="fr-FR"/>
         </w:rPr>
-        <w:t>5ème</w:t>
+        <w:t>5e</w:t>
       </w:r>
       <w:r>
         <w:rPr>
@@ -723,7 +723,7 @@
         <w:rPr>
           <w:lang w:val="fr-FR"/>
         </w:rPr>
-        <w:t>E-mail</w:t>
+        <w:t>Email</w:t>
       </w:r>
       <w:proofErr w:type="gramEnd"/>
       <w:r>
@@ -2146,7 +2146,7 @@
           <w:bCs/>
           <w:lang w:val="fr-FR"/>
         </w:rPr>
-        <w:t>maîtrise)</w:t>
+        <w:t>Maîtrise)</w:t>
       </w:r>
     </w:p>
     <w:p>
@@ -2895,14 +2895,14 @@
           <w:sz w:val="24"/>
           <w:szCs w:val="24"/>
         </w:rPr>
-        <w:t xml:space="preserve"> à la fin de chaque année financière vis-à-vis des résultats de l’année financière précédente, et sera soumis à l’impôt et </w:t>
-      </w:r>
-      <w:r>
-        <w:rPr>
-          <w:sz w:val="24"/>
-          <w:szCs w:val="24"/>
-        </w:rPr>
-        <w:t xml:space="preserve">aux </w:t>
+        <w:t xml:space="preserve"> à la fin de chaque année financière vis-à-vis des résultats de l’année financière précédente, et sera soumis aux impôts et </w:t>
+      </w:r>
+      <w:r>
+        <w:rPr>
+          <w:sz w:val="24"/>
+          <w:szCs w:val="24"/>
+        </w:rPr>
+        <w:t xml:space="preserve"/>
       </w:r>
       <w:r>
         <w:rPr>
@@ -3623,7 +3623,7 @@
           <w:szCs w:val="24"/>
           <w:lang w:val="fr-FR"/>
         </w:rPr>
-        <w:t>Décès du conjoint ou de l’enfant : 7 jours ouvrables ;</w:t>
+        <w:t>Décès du conjoint(e) ou de l’enfant : 7 jours ouvrables ;</w:t>
       </w:r>
     </w:p>
     <w:p>
@@ -3676,7 +3676,7 @@
           <w:szCs w:val="24"/>
           <w:lang w:val="fr-FR"/>
         </w:rPr>
-        <w:t>Décès du père ou de la mère du conjoint du travailleur : 5 jours ouvrables ;</w:t>
+        <w:t>Décès du père ou de la mère du conjoint(e) du travailleur : 5 jours ouvrables ;</w:t>
       </w:r>
     </w:p>
     <w:p>
@@ -4063,7 +4063,7 @@
           <w:szCs w:val="24"/>
           <w:lang w:val="fr-FR"/>
         </w:rPr>
-        <w:t xml:space="preserve">le </w:t>
+        <w:t xml:space="preserve"/>
       </w:r>
       <w:r>
         <w:rPr>

</xml_diff>